<commit_message>
Improve educational physics sandboxes
Refine the Haldane, Schreiner, M-value, gas filling, and gas-law teaching tools; standardize physical notation and localization; and hide unfinished Gradient Factors entry points.

Co-authored-by: Copilot <223556219+Copilot@users.noreply.github.com>
</commit_message>
<xml_diff>
--- a/docs/notation/export/slovnicek-velicin.docx
+++ b/docs/notation/export/slovnicek-velicin.docx
@@ -12192,7 +12192,7 @@
                 <w:iCs w:val="false"/>
                 <w:vertAlign w:val="subscript"/>
               </w:rPr>
-              <w:t xml:space="preserve">t</w:t>
+              <w:t xml:space="preserve">alv,0</w:t>
             </w:r>
           </w:p>
         </w:tc>
@@ -12224,7 +12224,7 @@
                 <w:i w:val="false"/>
                 <w:iCs w:val="false"/>
               </w:rPr>
-              <w:t xml:space="preserve">tlak inertního plynu v tkáni</w:t>
+              <w:t xml:space="preserve">počáteční alveolární tlak inertního plynu</w:t>
             </w:r>
           </w:p>
         </w:tc>
@@ -12256,7 +12256,7 @@
                 <w:i w:val="false"/>
                 <w:iCs w:val="false"/>
               </w:rPr>
-              <w:t xml:space="preserve">tissue inert gas pressure</w:t>
+              <w:t xml:space="preserve">initial alveolar inert gas pressure</w:t>
             </w:r>
           </w:p>
         </w:tc>
@@ -12320,7 +12320,7 @@
                 <w:i w:val="false"/>
                 <w:iCs w:val="false"/>
               </w:rPr>
-              <w:t xml:space="preserve">Bühlmann</w:t>
+              <w:t xml:space="preserve">Schreiner</w:t>
             </w:r>
           </w:p>
         </w:tc>
@@ -12367,6 +12367,181 @@
                 <w:iCs w:val="false"/>
                 <w:vertAlign w:val="subscript"/>
               </w:rPr>
+              <w:t xml:space="preserve">t</w:t>
+            </w:r>
+          </w:p>
+        </w:tc>
+        <w:tc>
+          <w:tcPr>
+            <w:tcW w:type="dxa" w:w="1805"/>
+            <w:tcBorders>
+              <w:top w:val="single" w:color="B8C4CE" w:sz="1"/>
+              <w:left w:val="single" w:color="B8C4CE" w:sz="1"/>
+              <w:bottom w:val="single" w:color="B8C4CE" w:sz="1"/>
+              <w:right w:val="single" w:color="B8C4CE" w:sz="1"/>
+            </w:tcBorders>
+            <w:tcMar>
+              <w:top w:type="dxa" w:w="60"/>
+              <w:left w:type="dxa" w:w="100"/>
+              <w:bottom w:type="dxa" w:w="60"/>
+              <w:right w:type="dxa" w:w="100"/>
+            </w:tcMar>
+            <w:vAlign w:val="center"/>
+          </w:tcPr>
+          <w:p>
+            <w:pPr>
+              <w:spacing w:before="20" w:after="20"/>
+            </w:pPr>
+            <w:r>
+              <w:rPr>
+                <w:b w:val="false"/>
+                <w:bCs w:val="false"/>
+                <w:i w:val="false"/>
+                <w:iCs w:val="false"/>
+              </w:rPr>
+              <w:t xml:space="preserve">tlak inertního plynu v tkáni</w:t>
+            </w:r>
+          </w:p>
+        </w:tc>
+        <w:tc>
+          <w:tcPr>
+            <w:tcW w:type="dxa" w:w="1805"/>
+            <w:tcBorders>
+              <w:top w:val="single" w:color="B8C4CE" w:sz="1"/>
+              <w:left w:val="single" w:color="B8C4CE" w:sz="1"/>
+              <w:bottom w:val="single" w:color="B8C4CE" w:sz="1"/>
+              <w:right w:val="single" w:color="B8C4CE" w:sz="1"/>
+            </w:tcBorders>
+            <w:tcMar>
+              <w:top w:type="dxa" w:w="60"/>
+              <w:left w:type="dxa" w:w="100"/>
+              <w:bottom w:type="dxa" w:w="60"/>
+              <w:right w:type="dxa" w:w="100"/>
+            </w:tcMar>
+            <w:vAlign w:val="center"/>
+          </w:tcPr>
+          <w:p>
+            <w:pPr>
+              <w:spacing w:before="20" w:after="20"/>
+            </w:pPr>
+            <w:r>
+              <w:rPr>
+                <w:b w:val="false"/>
+                <w:bCs w:val="false"/>
+                <w:i w:val="false"/>
+                <w:iCs w:val="false"/>
+              </w:rPr>
+              <w:t xml:space="preserve">tissue inert gas pressure</w:t>
+            </w:r>
+          </w:p>
+        </w:tc>
+        <w:tc>
+          <w:tcPr>
+            <w:tcW w:type="dxa" w:w="1805"/>
+            <w:tcBorders>
+              <w:top w:val="single" w:color="B8C4CE" w:sz="1"/>
+              <w:left w:val="single" w:color="B8C4CE" w:sz="1"/>
+              <w:bottom w:val="single" w:color="B8C4CE" w:sz="1"/>
+              <w:right w:val="single" w:color="B8C4CE" w:sz="1"/>
+            </w:tcBorders>
+            <w:tcMar>
+              <w:top w:type="dxa" w:w="60"/>
+              <w:left w:type="dxa" w:w="100"/>
+              <w:bottom w:type="dxa" w:w="60"/>
+              <w:right w:type="dxa" w:w="100"/>
+            </w:tcMar>
+            <w:vAlign w:val="center"/>
+          </w:tcPr>
+          <w:p>
+            <w:pPr>
+              <w:spacing w:before="20" w:after="20"/>
+            </w:pPr>
+            <w:r>
+              <w:rPr>
+                <w:b w:val="false"/>
+                <w:bCs w:val="false"/>
+                <w:i w:val="false"/>
+                <w:iCs w:val="false"/>
+              </w:rPr>
+              <w:t xml:space="preserve">bar</w:t>
+            </w:r>
+          </w:p>
+        </w:tc>
+        <w:tc>
+          <w:tcPr>
+            <w:tcW w:type="dxa" w:w="1806"/>
+            <w:tcBorders>
+              <w:top w:val="single" w:color="B8C4CE" w:sz="1"/>
+              <w:left w:val="single" w:color="B8C4CE" w:sz="1"/>
+              <w:bottom w:val="single" w:color="B8C4CE" w:sz="1"/>
+              <w:right w:val="single" w:color="B8C4CE" w:sz="1"/>
+            </w:tcBorders>
+            <w:tcMar>
+              <w:top w:type="dxa" w:w="60"/>
+              <w:left w:type="dxa" w:w="100"/>
+              <w:bottom w:type="dxa" w:w="60"/>
+              <w:right w:type="dxa" w:w="100"/>
+            </w:tcMar>
+            <w:vAlign w:val="center"/>
+          </w:tcPr>
+          <w:p>
+            <w:pPr>
+              <w:spacing w:before="20" w:after="20"/>
+            </w:pPr>
+            <w:r>
+              <w:rPr>
+                <w:b w:val="false"/>
+                <w:bCs w:val="false"/>
+                <w:i w:val="false"/>
+                <w:iCs w:val="false"/>
+              </w:rPr>
+              <w:t xml:space="preserve">Bühlmann</w:t>
+            </w:r>
+          </w:p>
+        </w:tc>
+      </w:tr>
+      <w:tr>
+        <w:trPr>
+          <w:tblHeader w:val="false"/>
+        </w:trPr>
+        <w:tc>
+          <w:tcPr>
+            <w:tcW w:type="dxa" w:w="1805"/>
+            <w:tcBorders>
+              <w:top w:val="single" w:color="B8C4CE" w:sz="1"/>
+              <w:left w:val="single" w:color="B8C4CE" w:sz="1"/>
+              <w:bottom w:val="single" w:color="B8C4CE" w:sz="1"/>
+              <w:right w:val="single" w:color="B8C4CE" w:sz="1"/>
+            </w:tcBorders>
+            <w:tcMar>
+              <w:top w:type="dxa" w:w="60"/>
+              <w:left w:type="dxa" w:w="100"/>
+              <w:bottom w:type="dxa" w:w="60"/>
+              <w:right w:type="dxa" w:w="100"/>
+            </w:tcMar>
+            <w:vAlign w:val="center"/>
+          </w:tcPr>
+          <w:p>
+            <w:pPr>
+              <w:spacing w:before="20" w:after="20"/>
+            </w:pPr>
+            <w:r>
+              <w:rPr>
+                <w:b w:val="false"/>
+                <w:bCs w:val="false"/>
+                <w:i/>
+                <w:iCs/>
+              </w:rPr>
+              <w:t xml:space="preserve">p</w:t>
+            </w:r>
+            <w:r>
+              <w:rPr>
+                <w:b w:val="false"/>
+                <w:bCs w:val="false"/>
+                <w:i w:val="false"/>
+                <w:iCs w:val="false"/>
+                <w:vertAlign w:val="subscript"/>
+              </w:rPr>
               <w:t xml:space="preserve">t,0</w:t>
             </w:r>
           </w:p>
@@ -12496,6 +12671,447 @@
                 <w:iCs w:val="false"/>
               </w:rPr>
               <w:t xml:space="preserve">Schreiner</w:t>
+            </w:r>
+          </w:p>
+        </w:tc>
+      </w:tr>
+      <w:tr>
+        <w:trPr>
+          <w:tblHeader w:val="false"/>
+        </w:trPr>
+        <w:tc>
+          <w:tcPr>
+            <w:tcW w:type="dxa" w:w="1805"/>
+            <w:tcBorders>
+              <w:top w:val="single" w:color="B8C4CE" w:sz="1"/>
+              <w:left w:val="single" w:color="B8C4CE" w:sz="1"/>
+              <w:bottom w:val="single" w:color="B8C4CE" w:sz="1"/>
+              <w:right w:val="single" w:color="B8C4CE" w:sz="1"/>
+            </w:tcBorders>
+            <w:tcMar>
+              <w:top w:type="dxa" w:w="60"/>
+              <w:left w:type="dxa" w:w="100"/>
+              <w:bottom w:type="dxa" w:w="60"/>
+              <w:right w:type="dxa" w:w="100"/>
+            </w:tcMar>
+            <w:vAlign w:val="center"/>
+          </w:tcPr>
+          <w:p>
+            <w:pPr>
+              <w:spacing w:before="20" w:after="20"/>
+            </w:pPr>
+            <w:r>
+              <w:rPr>
+                <w:b w:val="false"/>
+                <w:bCs w:val="false"/>
+                <w:i w:val="false"/>
+                <w:iCs w:val="false"/>
+              </w:rPr>
+              <w:t xml:space="preserve">Δ</w:t>
+            </w:r>
+            <w:r>
+              <w:rPr>
+                <w:b w:val="false"/>
+                <w:bCs w:val="false"/>
+                <w:i/>
+                <w:iCs/>
+              </w:rPr>
+              <w:t xml:space="preserve">p</w:t>
+            </w:r>
+          </w:p>
+        </w:tc>
+        <w:tc>
+          <w:tcPr>
+            <w:tcW w:type="dxa" w:w="1805"/>
+            <w:tcBorders>
+              <w:top w:val="single" w:color="B8C4CE" w:sz="1"/>
+              <w:left w:val="single" w:color="B8C4CE" w:sz="1"/>
+              <w:bottom w:val="single" w:color="B8C4CE" w:sz="1"/>
+              <w:right w:val="single" w:color="B8C4CE" w:sz="1"/>
+            </w:tcBorders>
+            <w:tcMar>
+              <w:top w:type="dxa" w:w="60"/>
+              <w:left w:type="dxa" w:w="100"/>
+              <w:bottom w:type="dxa" w:w="60"/>
+              <w:right w:type="dxa" w:w="100"/>
+            </w:tcMar>
+            <w:vAlign w:val="center"/>
+          </w:tcPr>
+          <w:p>
+            <w:pPr>
+              <w:spacing w:before="20" w:after="20"/>
+            </w:pPr>
+            <w:r>
+              <w:rPr>
+                <w:b w:val="false"/>
+                <w:bCs w:val="false"/>
+                <w:i w:val="false"/>
+                <w:iCs w:val="false"/>
+              </w:rPr>
+              <w:t xml:space="preserve">okamžitý rozdíl alveolárního a tkáňového tlaku, Δ</w:t>
+            </w:r>
+            <w:r>
+              <w:rPr>
+                <w:b w:val="false"/>
+                <w:bCs w:val="false"/>
+                <w:i/>
+                <w:iCs/>
+              </w:rPr>
+              <w:t xml:space="preserve">p</w:t>
+            </w:r>
+            <w:r>
+              <w:rPr>
+                <w:b w:val="false"/>
+                <w:bCs w:val="false"/>
+                <w:i w:val="false"/>
+                <w:iCs w:val="false"/>
+              </w:rPr>
+              <w:t xml:space="preserve"> = </w:t>
+            </w:r>
+            <w:r>
+              <w:rPr>
+                <w:b w:val="false"/>
+                <w:bCs w:val="false"/>
+                <w:i/>
+                <w:iCs/>
+              </w:rPr>
+              <w:t xml:space="preserve">p</w:t>
+            </w:r>
+            <w:r>
+              <w:rPr>
+                <w:b w:val="false"/>
+                <w:bCs w:val="false"/>
+                <w:i w:val="false"/>
+                <w:iCs w:val="false"/>
+                <w:vertAlign w:val="subscript"/>
+              </w:rPr>
+              <w:t xml:space="preserve">alv</w:t>
+            </w:r>
+            <w:r>
+              <w:rPr>
+                <w:b w:val="false"/>
+                <w:bCs w:val="false"/>
+                <w:i w:val="false"/>
+                <w:iCs w:val="false"/>
+              </w:rPr>
+              <w:t xml:space="preserve"> − </w:t>
+            </w:r>
+            <w:r>
+              <w:rPr>
+                <w:b w:val="false"/>
+                <w:bCs w:val="false"/>
+                <w:i/>
+                <w:iCs/>
+              </w:rPr>
+              <w:t xml:space="preserve">p</w:t>
+            </w:r>
+            <w:r>
+              <w:rPr>
+                <w:b w:val="false"/>
+                <w:bCs w:val="false"/>
+                <w:i w:val="false"/>
+                <w:iCs w:val="false"/>
+                <w:vertAlign w:val="subscript"/>
+              </w:rPr>
+              <w:t xml:space="preserve">t</w:t>
+            </w:r>
+          </w:p>
+        </w:tc>
+        <w:tc>
+          <w:tcPr>
+            <w:tcW w:type="dxa" w:w="1805"/>
+            <w:tcBorders>
+              <w:top w:val="single" w:color="B8C4CE" w:sz="1"/>
+              <w:left w:val="single" w:color="B8C4CE" w:sz="1"/>
+              <w:bottom w:val="single" w:color="B8C4CE" w:sz="1"/>
+              <w:right w:val="single" w:color="B8C4CE" w:sz="1"/>
+            </w:tcBorders>
+            <w:tcMar>
+              <w:top w:type="dxa" w:w="60"/>
+              <w:left w:type="dxa" w:w="100"/>
+              <w:bottom w:type="dxa" w:w="60"/>
+              <w:right w:type="dxa" w:w="100"/>
+            </w:tcMar>
+            <w:vAlign w:val="center"/>
+          </w:tcPr>
+          <w:p>
+            <w:pPr>
+              <w:spacing w:before="20" w:after="20"/>
+            </w:pPr>
+            <w:r>
+              <w:rPr>
+                <w:b w:val="false"/>
+                <w:bCs w:val="false"/>
+                <w:i w:val="false"/>
+                <w:iCs w:val="false"/>
+              </w:rPr>
+              <w:t xml:space="preserve">instantaneous alveolar–tissue pressure difference</w:t>
+            </w:r>
+          </w:p>
+        </w:tc>
+        <w:tc>
+          <w:tcPr>
+            <w:tcW w:type="dxa" w:w="1805"/>
+            <w:tcBorders>
+              <w:top w:val="single" w:color="B8C4CE" w:sz="1"/>
+              <w:left w:val="single" w:color="B8C4CE" w:sz="1"/>
+              <w:bottom w:val="single" w:color="B8C4CE" w:sz="1"/>
+              <w:right w:val="single" w:color="B8C4CE" w:sz="1"/>
+            </w:tcBorders>
+            <w:tcMar>
+              <w:top w:type="dxa" w:w="60"/>
+              <w:left w:type="dxa" w:w="100"/>
+              <w:bottom w:type="dxa" w:w="60"/>
+              <w:right w:type="dxa" w:w="100"/>
+            </w:tcMar>
+            <w:vAlign w:val="center"/>
+          </w:tcPr>
+          <w:p>
+            <w:pPr>
+              <w:spacing w:before="20" w:after="20"/>
+            </w:pPr>
+            <w:r>
+              <w:rPr>
+                <w:b w:val="false"/>
+                <w:bCs w:val="false"/>
+                <w:i w:val="false"/>
+                <w:iCs w:val="false"/>
+              </w:rPr>
+              <w:t xml:space="preserve">bar</w:t>
+            </w:r>
+          </w:p>
+        </w:tc>
+        <w:tc>
+          <w:tcPr>
+            <w:tcW w:type="dxa" w:w="1806"/>
+            <w:tcBorders>
+              <w:top w:val="single" w:color="B8C4CE" w:sz="1"/>
+              <w:left w:val="single" w:color="B8C4CE" w:sz="1"/>
+              <w:bottom w:val="single" w:color="B8C4CE" w:sz="1"/>
+              <w:right w:val="single" w:color="B8C4CE" w:sz="1"/>
+            </w:tcBorders>
+            <w:tcMar>
+              <w:top w:type="dxa" w:w="60"/>
+              <w:left w:type="dxa" w:w="100"/>
+              <w:bottom w:type="dxa" w:w="60"/>
+              <w:right w:type="dxa" w:w="100"/>
+            </w:tcMar>
+            <w:vAlign w:val="center"/>
+          </w:tcPr>
+          <w:p>
+            <w:pPr>
+              <w:spacing w:before="20" w:after="20"/>
+            </w:pPr>
+            <w:r>
+              <w:rPr>
+                <w:b w:val="false"/>
+                <w:bCs w:val="false"/>
+                <w:i w:val="false"/>
+                <w:iCs w:val="false"/>
+              </w:rPr>
+              <w:t xml:space="preserve">místní značení stránky Schreinerovy rovnice</w:t>
+            </w:r>
+          </w:p>
+        </w:tc>
+      </w:tr>
+      <w:tr>
+        <w:trPr>
+          <w:tblHeader w:val="false"/>
+        </w:trPr>
+        <w:tc>
+          <w:tcPr>
+            <w:tcW w:type="dxa" w:w="1805"/>
+            <w:tcBorders>
+              <w:top w:val="single" w:color="B8C4CE" w:sz="1"/>
+              <w:left w:val="single" w:color="B8C4CE" w:sz="1"/>
+              <w:bottom w:val="single" w:color="B8C4CE" w:sz="1"/>
+              <w:right w:val="single" w:color="B8C4CE" w:sz="1"/>
+            </w:tcBorders>
+            <w:tcMar>
+              <w:top w:type="dxa" w:w="60"/>
+              <w:left w:type="dxa" w:w="100"/>
+              <w:bottom w:type="dxa" w:w="60"/>
+              <w:right w:type="dxa" w:w="100"/>
+            </w:tcMar>
+            <w:vAlign w:val="center"/>
+          </w:tcPr>
+          <w:p>
+            <w:pPr>
+              <w:spacing w:before="20" w:after="20"/>
+            </w:pPr>
+            <w:r>
+              <w:rPr>
+                <w:b w:val="false"/>
+                <w:bCs w:val="false"/>
+                <w:i w:val="false"/>
+                <w:iCs w:val="false"/>
+              </w:rPr>
+              <w:t xml:space="preserve">d</w:t>
+            </w:r>
+            <w:r>
+              <w:rPr>
+                <w:b w:val="false"/>
+                <w:bCs w:val="false"/>
+                <w:i/>
+                <w:iCs/>
+              </w:rPr>
+              <w:t xml:space="preserve">p</w:t>
+            </w:r>
+            <w:r>
+              <w:rPr>
+                <w:b w:val="false"/>
+                <w:bCs w:val="false"/>
+                <w:i w:val="false"/>
+                <w:iCs w:val="false"/>
+                <w:vertAlign w:val="subscript"/>
+              </w:rPr>
+              <w:t xml:space="preserve">t</w:t>
+            </w:r>
+            <w:r>
+              <w:rPr>
+                <w:b w:val="false"/>
+                <w:bCs w:val="false"/>
+                <w:i w:val="false"/>
+                <w:iCs w:val="false"/>
+              </w:rPr>
+              <w:t xml:space="preserve">/d</w:t>
+            </w:r>
+            <w:r>
+              <w:rPr>
+                <w:b w:val="false"/>
+                <w:bCs w:val="false"/>
+                <w:i/>
+                <w:iCs/>
+              </w:rPr>
+              <w:t xml:space="preserve">t</w:t>
+            </w:r>
+          </w:p>
+        </w:tc>
+        <w:tc>
+          <w:tcPr>
+            <w:tcW w:type="dxa" w:w="1805"/>
+            <w:tcBorders>
+              <w:top w:val="single" w:color="B8C4CE" w:sz="1"/>
+              <w:left w:val="single" w:color="B8C4CE" w:sz="1"/>
+              <w:bottom w:val="single" w:color="B8C4CE" w:sz="1"/>
+              <w:right w:val="single" w:color="B8C4CE" w:sz="1"/>
+            </w:tcBorders>
+            <w:tcMar>
+              <w:top w:type="dxa" w:w="60"/>
+              <w:left w:type="dxa" w:w="100"/>
+              <w:bottom w:type="dxa" w:w="60"/>
+              <w:right w:type="dxa" w:w="100"/>
+            </w:tcMar>
+            <w:vAlign w:val="center"/>
+          </w:tcPr>
+          <w:p>
+            <w:pPr>
+              <w:spacing w:before="20" w:after="20"/>
+            </w:pPr>
+            <w:r>
+              <w:rPr>
+                <w:b w:val="false"/>
+                <w:bCs w:val="false"/>
+                <w:i w:val="false"/>
+                <w:iCs w:val="false"/>
+              </w:rPr>
+              <w:t xml:space="preserve">okamžitá rychlost změny tlaku inertního plynu v tkáni</w:t>
+            </w:r>
+          </w:p>
+        </w:tc>
+        <w:tc>
+          <w:tcPr>
+            <w:tcW w:type="dxa" w:w="1805"/>
+            <w:tcBorders>
+              <w:top w:val="single" w:color="B8C4CE" w:sz="1"/>
+              <w:left w:val="single" w:color="B8C4CE" w:sz="1"/>
+              <w:bottom w:val="single" w:color="B8C4CE" w:sz="1"/>
+              <w:right w:val="single" w:color="B8C4CE" w:sz="1"/>
+            </w:tcBorders>
+            <w:tcMar>
+              <w:top w:type="dxa" w:w="60"/>
+              <w:left w:type="dxa" w:w="100"/>
+              <w:bottom w:type="dxa" w:w="60"/>
+              <w:right w:type="dxa" w:w="100"/>
+            </w:tcMar>
+            <w:vAlign w:val="center"/>
+          </w:tcPr>
+          <w:p>
+            <w:pPr>
+              <w:spacing w:before="20" w:after="20"/>
+            </w:pPr>
+            <w:r>
+              <w:rPr>
+                <w:b w:val="false"/>
+                <w:bCs w:val="false"/>
+                <w:i w:val="false"/>
+                <w:iCs w:val="false"/>
+              </w:rPr>
+              <w:t xml:space="preserve">instantaneous rate of tissue inert-gas pressure change</w:t>
+            </w:r>
+          </w:p>
+        </w:tc>
+        <w:tc>
+          <w:tcPr>
+            <w:tcW w:type="dxa" w:w="1805"/>
+            <w:tcBorders>
+              <w:top w:val="single" w:color="B8C4CE" w:sz="1"/>
+              <w:left w:val="single" w:color="B8C4CE" w:sz="1"/>
+              <w:bottom w:val="single" w:color="B8C4CE" w:sz="1"/>
+              <w:right w:val="single" w:color="B8C4CE" w:sz="1"/>
+            </w:tcBorders>
+            <w:tcMar>
+              <w:top w:type="dxa" w:w="60"/>
+              <w:left w:type="dxa" w:w="100"/>
+              <w:bottom w:type="dxa" w:w="60"/>
+              <w:right w:type="dxa" w:w="100"/>
+            </w:tcMar>
+            <w:vAlign w:val="center"/>
+          </w:tcPr>
+          <w:p>
+            <w:pPr>
+              <w:spacing w:before="20" w:after="20"/>
+            </w:pPr>
+            <w:r>
+              <w:rPr>
+                <w:b w:val="false"/>
+                <w:bCs w:val="false"/>
+                <w:i w:val="false"/>
+                <w:iCs w:val="false"/>
+              </w:rPr>
+              <w:t xml:space="preserve">bar/min</w:t>
+            </w:r>
+          </w:p>
+        </w:tc>
+        <w:tc>
+          <w:tcPr>
+            <w:tcW w:type="dxa" w:w="1806"/>
+            <w:tcBorders>
+              <w:top w:val="single" w:color="B8C4CE" w:sz="1"/>
+              <w:left w:val="single" w:color="B8C4CE" w:sz="1"/>
+              <w:bottom w:val="single" w:color="B8C4CE" w:sz="1"/>
+              <w:right w:val="single" w:color="B8C4CE" w:sz="1"/>
+            </w:tcBorders>
+            <w:tcMar>
+              <w:top w:type="dxa" w:w="60"/>
+              <w:left w:type="dxa" w:w="100"/>
+              <w:bottom w:type="dxa" w:w="60"/>
+              <w:right w:type="dxa" w:w="100"/>
+            </w:tcMar>
+            <w:vAlign w:val="center"/>
+          </w:tcPr>
+          <w:p>
+            <w:pPr>
+              <w:spacing w:before="20" w:after="20"/>
+            </w:pPr>
+            <w:r>
+              <w:rPr>
+                <w:b w:val="false"/>
+                <w:bCs w:val="false"/>
+                <w:i w:val="false"/>
+                <w:iCs w:val="false"/>
+              </w:rPr>
+              <w:t xml:space="preserve">Haldaneův diferenciální zákon</w:t>
             </w:r>
           </w:p>
         </w:tc>

</xml_diff>

<commit_message>
Align tissue loading notation and layout
Co-authored-by: Copilot <223556219+Copilot@users.noreply.github.com>
</commit_message>
<xml_diff>
--- a/docs/notation/export/slovnicek-velicin.docx
+++ b/docs/notation/export/slovnicek-velicin.docx
@@ -5640,6 +5640,400 @@
                 <w:iCs w:val="false"/>
               </w:rPr>
               <w:t xml:space="preserve">ISO 80000-9</w:t>
+            </w:r>
+          </w:p>
+        </w:tc>
+      </w:tr>
+      <w:tr>
+        <w:trPr>
+          <w:tblHeader w:val="false"/>
+        </w:trPr>
+        <w:tc>
+          <w:tcPr>
+            <w:tcW w:type="dxa" w:w="1504"/>
+            <w:tcBorders>
+              <w:top w:val="single" w:color="B8C4CE" w:sz="1"/>
+              <w:left w:val="single" w:color="B8C4CE" w:sz="1"/>
+              <w:bottom w:val="single" w:color="B8C4CE" w:sz="1"/>
+              <w:right w:val="single" w:color="B8C4CE" w:sz="1"/>
+            </w:tcBorders>
+            <w:tcMar>
+              <w:top w:type="dxa" w:w="60"/>
+              <w:left w:type="dxa" w:w="100"/>
+              <w:bottom w:type="dxa" w:w="60"/>
+              <w:right w:type="dxa" w:w="100"/>
+            </w:tcMar>
+            <w:vAlign w:val="center"/>
+          </w:tcPr>
+          <w:p>
+            <w:pPr>
+              <w:spacing w:before="20" w:after="20"/>
+            </w:pPr>
+            <w:r>
+              <w:rPr>
+                <w:b w:val="false"/>
+                <w:bCs w:val="false"/>
+                <w:i/>
+                <w:iCs/>
+              </w:rPr>
+              <w:t xml:space="preserve">γ</w:t>
+            </w:r>
+          </w:p>
+        </w:tc>
+        <w:tc>
+          <w:tcPr>
+            <w:tcW w:type="dxa" w:w="1504"/>
+            <w:tcBorders>
+              <w:top w:val="single" w:color="B8C4CE" w:sz="1"/>
+              <w:left w:val="single" w:color="B8C4CE" w:sz="1"/>
+              <w:bottom w:val="single" w:color="B8C4CE" w:sz="1"/>
+              <w:right w:val="single" w:color="B8C4CE" w:sz="1"/>
+            </w:tcBorders>
+            <w:tcMar>
+              <w:top w:type="dxa" w:w="60"/>
+              <w:left w:type="dxa" w:w="100"/>
+              <w:bottom w:type="dxa" w:w="60"/>
+              <w:right w:type="dxa" w:w="100"/>
+            </w:tcMar>
+            <w:vAlign w:val="center"/>
+          </w:tcPr>
+          <w:p>
+            <w:pPr>
+              <w:spacing w:before="20" w:after="20"/>
+            </w:pPr>
+            <w:r>
+              <w:rPr>
+                <w:b w:val="false"/>
+                <w:bCs w:val="false"/>
+                <w:i w:val="false"/>
+                <w:iCs w:val="false"/>
+              </w:rPr>
+              <w:t xml:space="preserve">povrchové napětí</w:t>
+            </w:r>
+          </w:p>
+        </w:tc>
+        <w:tc>
+          <w:tcPr>
+            <w:tcW w:type="dxa" w:w="1504"/>
+            <w:tcBorders>
+              <w:top w:val="single" w:color="B8C4CE" w:sz="1"/>
+              <w:left w:val="single" w:color="B8C4CE" w:sz="1"/>
+              <w:bottom w:val="single" w:color="B8C4CE" w:sz="1"/>
+              <w:right w:val="single" w:color="B8C4CE" w:sz="1"/>
+            </w:tcBorders>
+            <w:tcMar>
+              <w:top w:type="dxa" w:w="60"/>
+              <w:left w:type="dxa" w:w="100"/>
+              <w:bottom w:type="dxa" w:w="60"/>
+              <w:right w:type="dxa" w:w="100"/>
+            </w:tcMar>
+            <w:vAlign w:val="center"/>
+          </w:tcPr>
+          <w:p>
+            <w:pPr>
+              <w:spacing w:before="20" w:after="20"/>
+            </w:pPr>
+            <w:r>
+              <w:rPr>
+                <w:b w:val="false"/>
+                <w:bCs w:val="false"/>
+                <w:i w:val="false"/>
+                <w:iCs w:val="false"/>
+              </w:rPr>
+              <w:t xml:space="preserve">surface tension</w:t>
+            </w:r>
+          </w:p>
+        </w:tc>
+        <w:tc>
+          <w:tcPr>
+            <w:tcW w:type="dxa" w:w="1504"/>
+            <w:tcBorders>
+              <w:top w:val="single" w:color="B8C4CE" w:sz="1"/>
+              <w:left w:val="single" w:color="B8C4CE" w:sz="1"/>
+              <w:bottom w:val="single" w:color="B8C4CE" w:sz="1"/>
+              <w:right w:val="single" w:color="B8C4CE" w:sz="1"/>
+            </w:tcBorders>
+            <w:tcMar>
+              <w:top w:type="dxa" w:w="60"/>
+              <w:left w:type="dxa" w:w="100"/>
+              <w:bottom w:type="dxa" w:w="60"/>
+              <w:right w:type="dxa" w:w="100"/>
+            </w:tcMar>
+            <w:vAlign w:val="center"/>
+          </w:tcPr>
+          <w:p>
+            <w:pPr>
+              <w:spacing w:before="20" w:after="20"/>
+            </w:pPr>
+            <w:r>
+              <w:rPr>
+                <w:b w:val="false"/>
+                <w:bCs w:val="false"/>
+                <w:i w:val="false"/>
+                <w:iCs w:val="false"/>
+              </w:rPr>
+              <w:t xml:space="preserve">N/m</w:t>
+            </w:r>
+          </w:p>
+        </w:tc>
+        <w:tc>
+          <w:tcPr>
+            <w:tcW w:type="dxa" w:w="1504"/>
+            <w:tcBorders>
+              <w:top w:val="single" w:color="B8C4CE" w:sz="1"/>
+              <w:left w:val="single" w:color="B8C4CE" w:sz="1"/>
+              <w:bottom w:val="single" w:color="B8C4CE" w:sz="1"/>
+              <w:right w:val="single" w:color="B8C4CE" w:sz="1"/>
+            </w:tcBorders>
+            <w:tcMar>
+              <w:top w:type="dxa" w:w="60"/>
+              <w:left w:type="dxa" w:w="100"/>
+              <w:bottom w:type="dxa" w:w="60"/>
+              <w:right w:type="dxa" w:w="100"/>
+            </w:tcMar>
+            <w:vAlign w:val="center"/>
+          </w:tcPr>
+          <w:p>
+            <w:pPr>
+              <w:spacing w:before="20" w:after="20"/>
+            </w:pPr>
+            <w:r>
+              <w:rPr>
+                <w:b w:val="false"/>
+                <w:bCs w:val="false"/>
+                <w:i w:val="false"/>
+                <w:iCs w:val="false"/>
+              </w:rPr>
+              <w:t xml:space="preserve">v modelu mechaniky bublin</w:t>
+            </w:r>
+          </w:p>
+        </w:tc>
+        <w:tc>
+          <w:tcPr>
+            <w:tcW w:type="dxa" w:w="1506"/>
+            <w:tcBorders>
+              <w:top w:val="single" w:color="B8C4CE" w:sz="1"/>
+              <w:left w:val="single" w:color="B8C4CE" w:sz="1"/>
+              <w:bottom w:val="single" w:color="B8C4CE" w:sz="1"/>
+              <w:right w:val="single" w:color="B8C4CE" w:sz="1"/>
+            </w:tcBorders>
+            <w:tcMar>
+              <w:top w:type="dxa" w:w="60"/>
+              <w:left w:type="dxa" w:w="100"/>
+              <w:bottom w:type="dxa" w:w="60"/>
+              <w:right w:type="dxa" w:w="100"/>
+            </w:tcMar>
+            <w:vAlign w:val="center"/>
+          </w:tcPr>
+          <w:p>
+            <w:pPr>
+              <w:spacing w:before="20" w:after="20"/>
+            </w:pPr>
+            <w:r>
+              <w:rPr>
+                <w:b w:val="false"/>
+                <w:bCs w:val="false"/>
+                <w:i w:val="false"/>
+                <w:iCs w:val="false"/>
+              </w:rPr>
+              <w:t xml:space="preserve">Laplaceův tlak</w:t>
+            </w:r>
+          </w:p>
+        </w:tc>
+      </w:tr>
+      <w:tr>
+        <w:trPr>
+          <w:tblHeader w:val="false"/>
+        </w:trPr>
+        <w:tc>
+          <w:tcPr>
+            <w:tcW w:type="dxa" w:w="1504"/>
+            <w:tcBorders>
+              <w:top w:val="single" w:color="B8C4CE" w:sz="1"/>
+              <w:left w:val="single" w:color="B8C4CE" w:sz="1"/>
+              <w:bottom w:val="single" w:color="B8C4CE" w:sz="1"/>
+              <w:right w:val="single" w:color="B8C4CE" w:sz="1"/>
+            </w:tcBorders>
+            <w:tcMar>
+              <w:top w:type="dxa" w:w="60"/>
+              <w:left w:type="dxa" w:w="100"/>
+              <w:bottom w:type="dxa" w:w="60"/>
+              <w:right w:type="dxa" w:w="100"/>
+            </w:tcMar>
+            <w:vAlign w:val="center"/>
+          </w:tcPr>
+          <w:p>
+            <w:pPr>
+              <w:spacing w:before="20" w:after="20"/>
+            </w:pPr>
+            <w:r>
+              <w:rPr>
+                <w:b w:val="false"/>
+                <w:bCs w:val="false"/>
+                <w:i/>
+                <w:iCs/>
+              </w:rPr>
+              <w:t xml:space="preserve">r</w:t>
+            </w:r>
+          </w:p>
+        </w:tc>
+        <w:tc>
+          <w:tcPr>
+            <w:tcW w:type="dxa" w:w="1504"/>
+            <w:tcBorders>
+              <w:top w:val="single" w:color="B8C4CE" w:sz="1"/>
+              <w:left w:val="single" w:color="B8C4CE" w:sz="1"/>
+              <w:bottom w:val="single" w:color="B8C4CE" w:sz="1"/>
+              <w:right w:val="single" w:color="B8C4CE" w:sz="1"/>
+            </w:tcBorders>
+            <w:tcMar>
+              <w:top w:type="dxa" w:w="60"/>
+              <w:left w:type="dxa" w:w="100"/>
+              <w:bottom w:type="dxa" w:w="60"/>
+              <w:right w:type="dxa" w:w="100"/>
+            </w:tcMar>
+            <w:vAlign w:val="center"/>
+          </w:tcPr>
+          <w:p>
+            <w:pPr>
+              <w:spacing w:before="20" w:after="20"/>
+            </w:pPr>
+            <w:r>
+              <w:rPr>
+                <w:b w:val="false"/>
+                <w:bCs w:val="false"/>
+                <w:i w:val="false"/>
+                <w:iCs w:val="false"/>
+              </w:rPr>
+              <w:t xml:space="preserve">poloměr bubliny</w:t>
+            </w:r>
+          </w:p>
+        </w:tc>
+        <w:tc>
+          <w:tcPr>
+            <w:tcW w:type="dxa" w:w="1504"/>
+            <w:tcBorders>
+              <w:top w:val="single" w:color="B8C4CE" w:sz="1"/>
+              <w:left w:val="single" w:color="B8C4CE" w:sz="1"/>
+              <w:bottom w:val="single" w:color="B8C4CE" w:sz="1"/>
+              <w:right w:val="single" w:color="B8C4CE" w:sz="1"/>
+            </w:tcBorders>
+            <w:tcMar>
+              <w:top w:type="dxa" w:w="60"/>
+              <w:left w:type="dxa" w:w="100"/>
+              <w:bottom w:type="dxa" w:w="60"/>
+              <w:right w:type="dxa" w:w="100"/>
+            </w:tcMar>
+            <w:vAlign w:val="center"/>
+          </w:tcPr>
+          <w:p>
+            <w:pPr>
+              <w:spacing w:before="20" w:after="20"/>
+            </w:pPr>
+            <w:r>
+              <w:rPr>
+                <w:b w:val="false"/>
+                <w:bCs w:val="false"/>
+                <w:i w:val="false"/>
+                <w:iCs w:val="false"/>
+              </w:rPr>
+              <w:t xml:space="preserve">bubble radius</w:t>
+            </w:r>
+          </w:p>
+        </w:tc>
+        <w:tc>
+          <w:tcPr>
+            <w:tcW w:type="dxa" w:w="1504"/>
+            <w:tcBorders>
+              <w:top w:val="single" w:color="B8C4CE" w:sz="1"/>
+              <w:left w:val="single" w:color="B8C4CE" w:sz="1"/>
+              <w:bottom w:val="single" w:color="B8C4CE" w:sz="1"/>
+              <w:right w:val="single" w:color="B8C4CE" w:sz="1"/>
+            </w:tcBorders>
+            <w:tcMar>
+              <w:top w:type="dxa" w:w="60"/>
+              <w:left w:type="dxa" w:w="100"/>
+              <w:bottom w:type="dxa" w:w="60"/>
+              <w:right w:type="dxa" w:w="100"/>
+            </w:tcMar>
+            <w:vAlign w:val="center"/>
+          </w:tcPr>
+          <w:p>
+            <w:pPr>
+              <w:spacing w:before="20" w:after="20"/>
+            </w:pPr>
+            <w:r>
+              <w:rPr>
+                <w:b w:val="false"/>
+                <w:bCs w:val="false"/>
+                <w:i w:val="false"/>
+                <w:iCs w:val="false"/>
+              </w:rPr>
+              <w:t xml:space="preserve">μm</w:t>
+            </w:r>
+          </w:p>
+        </w:tc>
+        <w:tc>
+          <w:tcPr>
+            <w:tcW w:type="dxa" w:w="1504"/>
+            <w:tcBorders>
+              <w:top w:val="single" w:color="B8C4CE" w:sz="1"/>
+              <w:left w:val="single" w:color="B8C4CE" w:sz="1"/>
+              <w:bottom w:val="single" w:color="B8C4CE" w:sz="1"/>
+              <w:right w:val="single" w:color="B8C4CE" w:sz="1"/>
+            </w:tcBorders>
+            <w:tcMar>
+              <w:top w:type="dxa" w:w="60"/>
+              <w:left w:type="dxa" w:w="100"/>
+              <w:bottom w:type="dxa" w:w="60"/>
+              <w:right w:type="dxa" w:w="100"/>
+            </w:tcMar>
+            <w:vAlign w:val="center"/>
+          </w:tcPr>
+          <w:p>
+            <w:pPr>
+              <w:spacing w:before="20" w:after="20"/>
+            </w:pPr>
+            <w:r>
+              <w:rPr>
+                <w:b w:val="false"/>
+                <w:bCs w:val="false"/>
+                <w:i w:val="false"/>
+                <w:iCs w:val="false"/>
+              </w:rPr>
+              <w:t xml:space="preserve">SI: m; v modelu mechaniky bublin</w:t>
+            </w:r>
+          </w:p>
+        </w:tc>
+        <w:tc>
+          <w:tcPr>
+            <w:tcW w:type="dxa" w:w="1506"/>
+            <w:tcBorders>
+              <w:top w:val="single" w:color="B8C4CE" w:sz="1"/>
+              <w:left w:val="single" w:color="B8C4CE" w:sz="1"/>
+              <w:bottom w:val="single" w:color="B8C4CE" w:sz="1"/>
+              <w:right w:val="single" w:color="B8C4CE" w:sz="1"/>
+            </w:tcBorders>
+            <w:tcMar>
+              <w:top w:type="dxa" w:w="60"/>
+              <w:left w:type="dxa" w:w="100"/>
+              <w:bottom w:type="dxa" w:w="60"/>
+              <w:right w:type="dxa" w:w="100"/>
+            </w:tcMar>
+            <w:vAlign w:val="center"/>
+          </w:tcPr>
+          <w:p>
+            <w:pPr>
+              <w:spacing w:before="20" w:after="20"/>
+            </w:pPr>
+            <w:r>
+              <w:rPr>
+                <w:b w:val="false"/>
+                <w:bCs w:val="false"/>
+                <w:i w:val="false"/>
+                <w:iCs w:val="false"/>
+              </w:rPr>
+              <w:t xml:space="preserve">geometrie / Laplaceův tlak</w:t>
             </w:r>
           </w:p>
         </w:tc>

</xml_diff>

<commit_message>
Align tissue loading notation and layout (#163)
Co-authored-by: Copilot <223556219+Copilot@users.noreply.github.com>
</commit_message>
<xml_diff>
--- a/docs/notation/export/slovnicek-velicin.docx
+++ b/docs/notation/export/slovnicek-velicin.docx
@@ -5640,6 +5640,400 @@
                 <w:iCs w:val="false"/>
               </w:rPr>
               <w:t xml:space="preserve">ISO 80000-9</w:t>
+            </w:r>
+          </w:p>
+        </w:tc>
+      </w:tr>
+      <w:tr>
+        <w:trPr>
+          <w:tblHeader w:val="false"/>
+        </w:trPr>
+        <w:tc>
+          <w:tcPr>
+            <w:tcW w:type="dxa" w:w="1504"/>
+            <w:tcBorders>
+              <w:top w:val="single" w:color="B8C4CE" w:sz="1"/>
+              <w:left w:val="single" w:color="B8C4CE" w:sz="1"/>
+              <w:bottom w:val="single" w:color="B8C4CE" w:sz="1"/>
+              <w:right w:val="single" w:color="B8C4CE" w:sz="1"/>
+            </w:tcBorders>
+            <w:tcMar>
+              <w:top w:type="dxa" w:w="60"/>
+              <w:left w:type="dxa" w:w="100"/>
+              <w:bottom w:type="dxa" w:w="60"/>
+              <w:right w:type="dxa" w:w="100"/>
+            </w:tcMar>
+            <w:vAlign w:val="center"/>
+          </w:tcPr>
+          <w:p>
+            <w:pPr>
+              <w:spacing w:before="20" w:after="20"/>
+            </w:pPr>
+            <w:r>
+              <w:rPr>
+                <w:b w:val="false"/>
+                <w:bCs w:val="false"/>
+                <w:i/>
+                <w:iCs/>
+              </w:rPr>
+              <w:t xml:space="preserve">γ</w:t>
+            </w:r>
+          </w:p>
+        </w:tc>
+        <w:tc>
+          <w:tcPr>
+            <w:tcW w:type="dxa" w:w="1504"/>
+            <w:tcBorders>
+              <w:top w:val="single" w:color="B8C4CE" w:sz="1"/>
+              <w:left w:val="single" w:color="B8C4CE" w:sz="1"/>
+              <w:bottom w:val="single" w:color="B8C4CE" w:sz="1"/>
+              <w:right w:val="single" w:color="B8C4CE" w:sz="1"/>
+            </w:tcBorders>
+            <w:tcMar>
+              <w:top w:type="dxa" w:w="60"/>
+              <w:left w:type="dxa" w:w="100"/>
+              <w:bottom w:type="dxa" w:w="60"/>
+              <w:right w:type="dxa" w:w="100"/>
+            </w:tcMar>
+            <w:vAlign w:val="center"/>
+          </w:tcPr>
+          <w:p>
+            <w:pPr>
+              <w:spacing w:before="20" w:after="20"/>
+            </w:pPr>
+            <w:r>
+              <w:rPr>
+                <w:b w:val="false"/>
+                <w:bCs w:val="false"/>
+                <w:i w:val="false"/>
+                <w:iCs w:val="false"/>
+              </w:rPr>
+              <w:t xml:space="preserve">povrchové napětí</w:t>
+            </w:r>
+          </w:p>
+        </w:tc>
+        <w:tc>
+          <w:tcPr>
+            <w:tcW w:type="dxa" w:w="1504"/>
+            <w:tcBorders>
+              <w:top w:val="single" w:color="B8C4CE" w:sz="1"/>
+              <w:left w:val="single" w:color="B8C4CE" w:sz="1"/>
+              <w:bottom w:val="single" w:color="B8C4CE" w:sz="1"/>
+              <w:right w:val="single" w:color="B8C4CE" w:sz="1"/>
+            </w:tcBorders>
+            <w:tcMar>
+              <w:top w:type="dxa" w:w="60"/>
+              <w:left w:type="dxa" w:w="100"/>
+              <w:bottom w:type="dxa" w:w="60"/>
+              <w:right w:type="dxa" w:w="100"/>
+            </w:tcMar>
+            <w:vAlign w:val="center"/>
+          </w:tcPr>
+          <w:p>
+            <w:pPr>
+              <w:spacing w:before="20" w:after="20"/>
+            </w:pPr>
+            <w:r>
+              <w:rPr>
+                <w:b w:val="false"/>
+                <w:bCs w:val="false"/>
+                <w:i w:val="false"/>
+                <w:iCs w:val="false"/>
+              </w:rPr>
+              <w:t xml:space="preserve">surface tension</w:t>
+            </w:r>
+          </w:p>
+        </w:tc>
+        <w:tc>
+          <w:tcPr>
+            <w:tcW w:type="dxa" w:w="1504"/>
+            <w:tcBorders>
+              <w:top w:val="single" w:color="B8C4CE" w:sz="1"/>
+              <w:left w:val="single" w:color="B8C4CE" w:sz="1"/>
+              <w:bottom w:val="single" w:color="B8C4CE" w:sz="1"/>
+              <w:right w:val="single" w:color="B8C4CE" w:sz="1"/>
+            </w:tcBorders>
+            <w:tcMar>
+              <w:top w:type="dxa" w:w="60"/>
+              <w:left w:type="dxa" w:w="100"/>
+              <w:bottom w:type="dxa" w:w="60"/>
+              <w:right w:type="dxa" w:w="100"/>
+            </w:tcMar>
+            <w:vAlign w:val="center"/>
+          </w:tcPr>
+          <w:p>
+            <w:pPr>
+              <w:spacing w:before="20" w:after="20"/>
+            </w:pPr>
+            <w:r>
+              <w:rPr>
+                <w:b w:val="false"/>
+                <w:bCs w:val="false"/>
+                <w:i w:val="false"/>
+                <w:iCs w:val="false"/>
+              </w:rPr>
+              <w:t xml:space="preserve">N/m</w:t>
+            </w:r>
+          </w:p>
+        </w:tc>
+        <w:tc>
+          <w:tcPr>
+            <w:tcW w:type="dxa" w:w="1504"/>
+            <w:tcBorders>
+              <w:top w:val="single" w:color="B8C4CE" w:sz="1"/>
+              <w:left w:val="single" w:color="B8C4CE" w:sz="1"/>
+              <w:bottom w:val="single" w:color="B8C4CE" w:sz="1"/>
+              <w:right w:val="single" w:color="B8C4CE" w:sz="1"/>
+            </w:tcBorders>
+            <w:tcMar>
+              <w:top w:type="dxa" w:w="60"/>
+              <w:left w:type="dxa" w:w="100"/>
+              <w:bottom w:type="dxa" w:w="60"/>
+              <w:right w:type="dxa" w:w="100"/>
+            </w:tcMar>
+            <w:vAlign w:val="center"/>
+          </w:tcPr>
+          <w:p>
+            <w:pPr>
+              <w:spacing w:before="20" w:after="20"/>
+            </w:pPr>
+            <w:r>
+              <w:rPr>
+                <w:b w:val="false"/>
+                <w:bCs w:val="false"/>
+                <w:i w:val="false"/>
+                <w:iCs w:val="false"/>
+              </w:rPr>
+              <w:t xml:space="preserve">v modelu mechaniky bublin</w:t>
+            </w:r>
+          </w:p>
+        </w:tc>
+        <w:tc>
+          <w:tcPr>
+            <w:tcW w:type="dxa" w:w="1506"/>
+            <w:tcBorders>
+              <w:top w:val="single" w:color="B8C4CE" w:sz="1"/>
+              <w:left w:val="single" w:color="B8C4CE" w:sz="1"/>
+              <w:bottom w:val="single" w:color="B8C4CE" w:sz="1"/>
+              <w:right w:val="single" w:color="B8C4CE" w:sz="1"/>
+            </w:tcBorders>
+            <w:tcMar>
+              <w:top w:type="dxa" w:w="60"/>
+              <w:left w:type="dxa" w:w="100"/>
+              <w:bottom w:type="dxa" w:w="60"/>
+              <w:right w:type="dxa" w:w="100"/>
+            </w:tcMar>
+            <w:vAlign w:val="center"/>
+          </w:tcPr>
+          <w:p>
+            <w:pPr>
+              <w:spacing w:before="20" w:after="20"/>
+            </w:pPr>
+            <w:r>
+              <w:rPr>
+                <w:b w:val="false"/>
+                <w:bCs w:val="false"/>
+                <w:i w:val="false"/>
+                <w:iCs w:val="false"/>
+              </w:rPr>
+              <w:t xml:space="preserve">Laplaceův tlak</w:t>
+            </w:r>
+          </w:p>
+        </w:tc>
+      </w:tr>
+      <w:tr>
+        <w:trPr>
+          <w:tblHeader w:val="false"/>
+        </w:trPr>
+        <w:tc>
+          <w:tcPr>
+            <w:tcW w:type="dxa" w:w="1504"/>
+            <w:tcBorders>
+              <w:top w:val="single" w:color="B8C4CE" w:sz="1"/>
+              <w:left w:val="single" w:color="B8C4CE" w:sz="1"/>
+              <w:bottom w:val="single" w:color="B8C4CE" w:sz="1"/>
+              <w:right w:val="single" w:color="B8C4CE" w:sz="1"/>
+            </w:tcBorders>
+            <w:tcMar>
+              <w:top w:type="dxa" w:w="60"/>
+              <w:left w:type="dxa" w:w="100"/>
+              <w:bottom w:type="dxa" w:w="60"/>
+              <w:right w:type="dxa" w:w="100"/>
+            </w:tcMar>
+            <w:vAlign w:val="center"/>
+          </w:tcPr>
+          <w:p>
+            <w:pPr>
+              <w:spacing w:before="20" w:after="20"/>
+            </w:pPr>
+            <w:r>
+              <w:rPr>
+                <w:b w:val="false"/>
+                <w:bCs w:val="false"/>
+                <w:i/>
+                <w:iCs/>
+              </w:rPr>
+              <w:t xml:space="preserve">r</w:t>
+            </w:r>
+          </w:p>
+        </w:tc>
+        <w:tc>
+          <w:tcPr>
+            <w:tcW w:type="dxa" w:w="1504"/>
+            <w:tcBorders>
+              <w:top w:val="single" w:color="B8C4CE" w:sz="1"/>
+              <w:left w:val="single" w:color="B8C4CE" w:sz="1"/>
+              <w:bottom w:val="single" w:color="B8C4CE" w:sz="1"/>
+              <w:right w:val="single" w:color="B8C4CE" w:sz="1"/>
+            </w:tcBorders>
+            <w:tcMar>
+              <w:top w:type="dxa" w:w="60"/>
+              <w:left w:type="dxa" w:w="100"/>
+              <w:bottom w:type="dxa" w:w="60"/>
+              <w:right w:type="dxa" w:w="100"/>
+            </w:tcMar>
+            <w:vAlign w:val="center"/>
+          </w:tcPr>
+          <w:p>
+            <w:pPr>
+              <w:spacing w:before="20" w:after="20"/>
+            </w:pPr>
+            <w:r>
+              <w:rPr>
+                <w:b w:val="false"/>
+                <w:bCs w:val="false"/>
+                <w:i w:val="false"/>
+                <w:iCs w:val="false"/>
+              </w:rPr>
+              <w:t xml:space="preserve">poloměr bubliny</w:t>
+            </w:r>
+          </w:p>
+        </w:tc>
+        <w:tc>
+          <w:tcPr>
+            <w:tcW w:type="dxa" w:w="1504"/>
+            <w:tcBorders>
+              <w:top w:val="single" w:color="B8C4CE" w:sz="1"/>
+              <w:left w:val="single" w:color="B8C4CE" w:sz="1"/>
+              <w:bottom w:val="single" w:color="B8C4CE" w:sz="1"/>
+              <w:right w:val="single" w:color="B8C4CE" w:sz="1"/>
+            </w:tcBorders>
+            <w:tcMar>
+              <w:top w:type="dxa" w:w="60"/>
+              <w:left w:type="dxa" w:w="100"/>
+              <w:bottom w:type="dxa" w:w="60"/>
+              <w:right w:type="dxa" w:w="100"/>
+            </w:tcMar>
+            <w:vAlign w:val="center"/>
+          </w:tcPr>
+          <w:p>
+            <w:pPr>
+              <w:spacing w:before="20" w:after="20"/>
+            </w:pPr>
+            <w:r>
+              <w:rPr>
+                <w:b w:val="false"/>
+                <w:bCs w:val="false"/>
+                <w:i w:val="false"/>
+                <w:iCs w:val="false"/>
+              </w:rPr>
+              <w:t xml:space="preserve">bubble radius</w:t>
+            </w:r>
+          </w:p>
+        </w:tc>
+        <w:tc>
+          <w:tcPr>
+            <w:tcW w:type="dxa" w:w="1504"/>
+            <w:tcBorders>
+              <w:top w:val="single" w:color="B8C4CE" w:sz="1"/>
+              <w:left w:val="single" w:color="B8C4CE" w:sz="1"/>
+              <w:bottom w:val="single" w:color="B8C4CE" w:sz="1"/>
+              <w:right w:val="single" w:color="B8C4CE" w:sz="1"/>
+            </w:tcBorders>
+            <w:tcMar>
+              <w:top w:type="dxa" w:w="60"/>
+              <w:left w:type="dxa" w:w="100"/>
+              <w:bottom w:type="dxa" w:w="60"/>
+              <w:right w:type="dxa" w:w="100"/>
+            </w:tcMar>
+            <w:vAlign w:val="center"/>
+          </w:tcPr>
+          <w:p>
+            <w:pPr>
+              <w:spacing w:before="20" w:after="20"/>
+            </w:pPr>
+            <w:r>
+              <w:rPr>
+                <w:b w:val="false"/>
+                <w:bCs w:val="false"/>
+                <w:i w:val="false"/>
+                <w:iCs w:val="false"/>
+              </w:rPr>
+              <w:t xml:space="preserve">μm</w:t>
+            </w:r>
+          </w:p>
+        </w:tc>
+        <w:tc>
+          <w:tcPr>
+            <w:tcW w:type="dxa" w:w="1504"/>
+            <w:tcBorders>
+              <w:top w:val="single" w:color="B8C4CE" w:sz="1"/>
+              <w:left w:val="single" w:color="B8C4CE" w:sz="1"/>
+              <w:bottom w:val="single" w:color="B8C4CE" w:sz="1"/>
+              <w:right w:val="single" w:color="B8C4CE" w:sz="1"/>
+            </w:tcBorders>
+            <w:tcMar>
+              <w:top w:type="dxa" w:w="60"/>
+              <w:left w:type="dxa" w:w="100"/>
+              <w:bottom w:type="dxa" w:w="60"/>
+              <w:right w:type="dxa" w:w="100"/>
+            </w:tcMar>
+            <w:vAlign w:val="center"/>
+          </w:tcPr>
+          <w:p>
+            <w:pPr>
+              <w:spacing w:before="20" w:after="20"/>
+            </w:pPr>
+            <w:r>
+              <w:rPr>
+                <w:b w:val="false"/>
+                <w:bCs w:val="false"/>
+                <w:i w:val="false"/>
+                <w:iCs w:val="false"/>
+              </w:rPr>
+              <w:t xml:space="preserve">SI: m; v modelu mechaniky bublin</w:t>
+            </w:r>
+          </w:p>
+        </w:tc>
+        <w:tc>
+          <w:tcPr>
+            <w:tcW w:type="dxa" w:w="1506"/>
+            <w:tcBorders>
+              <w:top w:val="single" w:color="B8C4CE" w:sz="1"/>
+              <w:left w:val="single" w:color="B8C4CE" w:sz="1"/>
+              <w:bottom w:val="single" w:color="B8C4CE" w:sz="1"/>
+              <w:right w:val="single" w:color="B8C4CE" w:sz="1"/>
+            </w:tcBorders>
+            <w:tcMar>
+              <w:top w:type="dxa" w:w="60"/>
+              <w:left w:type="dxa" w:w="100"/>
+              <w:bottom w:type="dxa" w:w="60"/>
+              <w:right w:type="dxa" w:w="100"/>
+            </w:tcMar>
+            <w:vAlign w:val="center"/>
+          </w:tcPr>
+          <w:p>
+            <w:pPr>
+              <w:spacing w:before="20" w:after="20"/>
+            </w:pPr>
+            <w:r>
+              <w:rPr>
+                <w:b w:val="false"/>
+                <w:bCs w:val="false"/>
+                <w:i w:val="false"/>
+                <w:iCs w:val="false"/>
+              </w:rPr>
+              <w:t xml:space="preserve">geometrie / Laplaceův tlak</w:t>
             </w:r>
           </w:p>
         </w:tc>

</xml_diff>